<commit_message>
Agrega Backlog Maestro en Excel y CSV para Notion; limpia la columna Tiempo estimado
Nuevos formatos: Backlog-Maestro-ClickUp.xlsx (editable, con autofiltro y
encabezado congelado) y Backlog-Maestro-Notion.csv (separador de valores
multiples en coma en vez de punto y coma, para que Notion los reconozca
como multi-select al importar).

La columna "Tiempo estimado" de las 93 tareas se reemplaza por "A definir"
en la fuente de verdad (backlog-maestro-clickup.csv) y se propaga a los
cuatro formatos derivados (CSV ClickUp, Word Oficio, Excel, CSV Notion).
</commit_message>
<xml_diff>
--- a/descargables/Backlog-Maestro-ClickUp.docx
+++ b/descargables/Backlog-Maestro-ClickUp.docx
@@ -737,7 +737,7 @@
               <w:rPr>
                 <w:sz w:val="14"/>
               </w:rPr>
-              <w:t>30 min</w:t>
+              <w:t>A definir</w:t>
             </w:r>
           </w:p>
         </w:tc>
@@ -1169,7 +1169,7 @@
               <w:rPr>
                 <w:sz w:val="14"/>
               </w:rPr>
-              <w:t>2-4 horas</w:t>
+              <w:t>A definir</w:t>
             </w:r>
           </w:p>
         </w:tc>
@@ -1602,7 +1602,7 @@
               <w:rPr>
                 <w:sz w:val="14"/>
               </w:rPr>
-              <w:t>1 hora</w:t>
+              <w:t>A definir</w:t>
             </w:r>
           </w:p>
         </w:tc>
@@ -2033,7 +2033,7 @@
               <w:rPr>
                 <w:sz w:val="14"/>
               </w:rPr>
-              <w:t>2-3 horas</w:t>
+              <w:t>A definir</w:t>
             </w:r>
           </w:p>
         </w:tc>
@@ -2465,7 +2465,7 @@
               <w:rPr>
                 <w:sz w:val="14"/>
               </w:rPr>
-              <w:t>1-3 dias habiles (aprobacion de Google)</w:t>
+              <w:t>A definir</w:t>
             </w:r>
           </w:p>
         </w:tc>
@@ -2896,7 +2896,7 @@
               <w:rPr>
                 <w:sz w:val="14"/>
               </w:rPr>
-              <w:t>2-4 horas</w:t>
+              <w:t>A definir</w:t>
             </w:r>
           </w:p>
         </w:tc>
@@ -3328,7 +3328,7 @@
               <w:rPr>
                 <w:sz w:val="14"/>
               </w:rPr>
-              <w:t>15 min</w:t>
+              <w:t>A definir</w:t>
             </w:r>
           </w:p>
         </w:tc>
@@ -3759,7 +3759,7 @@
               <w:rPr>
                 <w:sz w:val="14"/>
               </w:rPr>
-              <w:t>15 min</w:t>
+              <w:t>A definir</w:t>
             </w:r>
           </w:p>
         </w:tc>
@@ -4190,7 +4190,7 @@
               <w:rPr>
                 <w:sz w:val="14"/>
               </w:rPr>
-              <w:t>1-2 horas</w:t>
+              <w:t>A definir</w:t>
             </w:r>
           </w:p>
         </w:tc>
@@ -4621,7 +4621,7 @@
               <w:rPr>
                 <w:sz w:val="14"/>
               </w:rPr>
-              <w:t>1 reunion</w:t>
+              <w:t>A definir</w:t>
             </w:r>
           </w:p>
         </w:tc>
@@ -5053,7 +5053,7 @@
               <w:rPr>
                 <w:sz w:val="14"/>
               </w:rPr>
-              <w:t>1-2 dias</w:t>
+              <w:t>A definir</w:t>
             </w:r>
           </w:p>
         </w:tc>
@@ -5485,7 +5485,7 @@
               <w:rPr>
                 <w:sz w:val="14"/>
               </w:rPr>
-              <w:t>30 min de publicacion</w:t>
+              <w:t>A definir</w:t>
             </w:r>
           </w:p>
         </w:tc>
@@ -5916,7 +5916,7 @@
               <w:rPr>
                 <w:sz w:val="14"/>
               </w:rPr>
-              <w:t>1 reunion</w:t>
+              <w:t>A definir</w:t>
             </w:r>
           </w:p>
         </w:tc>
@@ -6347,7 +6347,7 @@
               <w:rPr>
                 <w:sz w:val="14"/>
               </w:rPr>
-              <w:t>1-2 horas</w:t>
+              <w:t>A definir</w:t>
             </w:r>
           </w:p>
         </w:tc>
@@ -6778,7 +6778,7 @@
               <w:rPr>
                 <w:sz w:val="14"/>
               </w:rPr>
-              <w:t>A definir por equipo legal</w:t>
+              <w:t>A definir</w:t>
             </w:r>
           </w:p>
         </w:tc>
@@ -7210,7 +7210,7 @@
               <w:rPr>
                 <w:sz w:val="14"/>
               </w:rPr>
-              <w:t>1-2 horas de analisis mas ajustes</w:t>
+              <w:t>A definir</w:t>
             </w:r>
           </w:p>
         </w:tc>
@@ -7640,7 +7640,7 @@
               <w:rPr>
                 <w:sz w:val="14"/>
               </w:rPr>
-              <w:t>20 min</w:t>
+              <w:t>A definir</w:t>
             </w:r>
           </w:p>
         </w:tc>
@@ -8070,7 +8070,7 @@
               <w:rPr>
                 <w:sz w:val="14"/>
               </w:rPr>
-              <w:t>15 min</w:t>
+              <w:t>A definir</w:t>
             </w:r>
           </w:p>
         </w:tc>
@@ -8499,7 +8499,7 @@
               <w:rPr>
                 <w:sz w:val="14"/>
               </w:rPr>
-              <w:t>15 min</w:t>
+              <w:t>A definir</w:t>
             </w:r>
           </w:p>
         </w:tc>
@@ -8928,7 +8928,7 @@
               <w:rPr>
                 <w:sz w:val="14"/>
               </w:rPr>
-              <w:t>1-2 horas</w:t>
+              <w:t>A definir</w:t>
             </w:r>
           </w:p>
         </w:tc>
@@ -9359,7 +9359,7 @@
               <w:rPr>
                 <w:sz w:val="14"/>
               </w:rPr>
-              <w:t>15 min</w:t>
+              <w:t>A definir</w:t>
             </w:r>
           </w:p>
         </w:tc>
@@ -9789,7 +9789,7 @@
               <w:rPr>
                 <w:sz w:val="14"/>
               </w:rPr>
-              <w:t>3-5 horas</w:t>
+              <w:t>A definir</w:t>
             </w:r>
           </w:p>
         </w:tc>
@@ -10218,7 +10218,7 @@
               <w:rPr>
                 <w:sz w:val="14"/>
               </w:rPr>
-              <w:t>5-9 horas combinadas</w:t>
+              <w:t>A definir</w:t>
             </w:r>
           </w:p>
         </w:tc>
@@ -10649,7 +10649,7 @@
               <w:rPr>
                 <w:sz w:val="14"/>
               </w:rPr>
-              <w:t>2-3 horas</w:t>
+              <w:t>A definir</w:t>
             </w:r>
           </w:p>
         </w:tc>
@@ -11079,7 +11079,7 @@
               <w:rPr>
                 <w:sz w:val="14"/>
               </w:rPr>
-              <w:t>Por definir segun calendario editorial</w:t>
+              <w:t>A definir</w:t>
             </w:r>
           </w:p>
         </w:tc>
@@ -11510,7 +11510,7 @@
               <w:rPr>
                 <w:sz w:val="14"/>
               </w:rPr>
-              <w:t>2 horas</w:t>
+              <w:t>A definir</w:t>
             </w:r>
           </w:p>
         </w:tc>
@@ -11941,7 +11941,7 @@
               <w:rPr>
                 <w:sz w:val="14"/>
               </w:rPr>
-              <w:t>1 hora combinada</w:t>
+              <w:t>A definir</w:t>
             </w:r>
           </w:p>
         </w:tc>
@@ -12371,7 +12371,7 @@
               <w:rPr>
                 <w:sz w:val="14"/>
               </w:rPr>
-              <w:t>15 min</w:t>
+              <w:t>A definir</w:t>
             </w:r>
           </w:p>
         </w:tc>
@@ -12800,7 +12800,7 @@
               <w:rPr>
                 <w:sz w:val="14"/>
               </w:rPr>
-              <w:t>15 min</w:t>
+              <w:t>A definir</w:t>
             </w:r>
           </w:p>
         </w:tc>
@@ -13229,7 +13229,7 @@
               <w:rPr>
                 <w:sz w:val="14"/>
               </w:rPr>
-              <w:t>A definir con equipo legal</w:t>
+              <w:t>A definir</w:t>
             </w:r>
           </w:p>
         </w:tc>
@@ -13659,7 +13659,7 @@
               <w:rPr>
                 <w:sz w:val="14"/>
               </w:rPr>
-              <w:t>3-4 horas</w:t>
+              <w:t>A definir</w:t>
             </w:r>
           </w:p>
         </w:tc>
@@ -14088,7 +14088,7 @@
               <w:rPr>
                 <w:sz w:val="14"/>
               </w:rPr>
-              <w:t>Continuo</w:t>
+              <w:t>A definir</w:t>
             </w:r>
           </w:p>
         </w:tc>
@@ -14518,7 +14518,7 @@
               <w:rPr>
                 <w:sz w:val="14"/>
               </w:rPr>
-              <w:t>2-4 horas</w:t>
+              <w:t>A definir</w:t>
             </w:r>
           </w:p>
         </w:tc>
@@ -14950,7 +14950,7 @@
               <w:rPr>
                 <w:sz w:val="14"/>
               </w:rPr>
-              <w:t>1-2 horas</w:t>
+              <w:t>A definir</w:t>
             </w:r>
           </w:p>
         </w:tc>
@@ -15380,7 +15380,7 @@
               <w:rPr>
                 <w:sz w:val="14"/>
               </w:rPr>
-              <w:t>1 dia + 2 semanas de test</w:t>
+              <w:t>A definir</w:t>
             </w:r>
           </w:p>
         </w:tc>
@@ -15810,7 +15810,7 @@
               <w:rPr>
                 <w:sz w:val="14"/>
               </w:rPr>
-              <w:t>1-2 horas</w:t>
+              <w:t>A definir</w:t>
             </w:r>
           </w:p>
         </w:tc>
@@ -16241,7 +16241,7 @@
               <w:rPr>
                 <w:sz w:val="14"/>
               </w:rPr>
-              <w:t>2-3 horas</w:t>
+              <w:t>A definir</w:t>
             </w:r>
           </w:p>
         </w:tc>
@@ -16671,7 +16671,7 @@
               <w:rPr>
                 <w:sz w:val="14"/>
               </w:rPr>
-              <w:t>2-3 horas</w:t>
+              <w:t>A definir</w:t>
             </w:r>
           </w:p>
         </w:tc>
@@ -17100,7 +17100,7 @@
               <w:rPr>
                 <w:sz w:val="14"/>
               </w:rPr>
-              <w:t>3-4 horas</w:t>
+              <w:t>A definir</w:t>
             </w:r>
           </w:p>
         </w:tc>
@@ -17530,7 +17530,7 @@
               <w:rPr>
                 <w:sz w:val="14"/>
               </w:rPr>
-              <w:t>1-2 horas</w:t>
+              <w:t>A definir</w:t>
             </w:r>
           </w:p>
         </w:tc>
@@ -17959,7 +17959,7 @@
               <w:rPr>
                 <w:sz w:val="14"/>
               </w:rPr>
-              <w:t>1-2 horas</w:t>
+              <w:t>A definir</w:t>
             </w:r>
           </w:p>
         </w:tc>
@@ -18388,7 +18388,7 @@
               <w:rPr>
                 <w:sz w:val="14"/>
               </w:rPr>
-              <w:t>3-4 horas</w:t>
+              <w:t>A definir</w:t>
             </w:r>
           </w:p>
         </w:tc>
@@ -18817,7 +18817,7 @@
               <w:rPr>
                 <w:sz w:val="14"/>
               </w:rPr>
-              <w:t>15 min</w:t>
+              <w:t>A definir</w:t>
             </w:r>
           </w:p>
         </w:tc>
@@ -19246,7 +19246,7 @@
               <w:rPr>
                 <w:sz w:val="14"/>
               </w:rPr>
-              <w:t>15 min</w:t>
+              <w:t>A definir</w:t>
             </w:r>
           </w:p>
         </w:tc>
@@ -19675,7 +19675,7 @@
               <w:rPr>
                 <w:sz w:val="14"/>
               </w:rPr>
-              <w:t>30 min</w:t>
+              <w:t>A definir</w:t>
             </w:r>
           </w:p>
         </w:tc>
@@ -20105,7 +20105,7 @@
               <w:rPr>
                 <w:sz w:val="14"/>
               </w:rPr>
-              <w:t>1 dia</w:t>
+              <w:t>A definir</w:t>
             </w:r>
           </w:p>
         </w:tc>
@@ -20536,7 +20536,7 @@
               <w:rPr>
                 <w:sz w:val="14"/>
               </w:rPr>
-              <w:t>1-2 horas c/u</w:t>
+              <w:t>A definir</w:t>
             </w:r>
           </w:p>
         </w:tc>
@@ -20965,7 +20965,7 @@
               <w:rPr>
                 <w:sz w:val="14"/>
               </w:rPr>
-              <w:t>2-3 horas</w:t>
+              <w:t>A definir</w:t>
             </w:r>
           </w:p>
         </w:tc>
@@ -21396,7 +21396,7 @@
               <w:rPr>
                 <w:sz w:val="14"/>
               </w:rPr>
-              <w:t>1-2 horas</w:t>
+              <w:t>A definir</w:t>
             </w:r>
           </w:p>
         </w:tc>
@@ -21825,7 +21825,7 @@
               <w:rPr>
                 <w:sz w:val="14"/>
               </w:rPr>
-              <w:t>2-3 horas</w:t>
+              <w:t>A definir</w:t>
             </w:r>
           </w:p>
         </w:tc>
@@ -22257,7 +22257,7 @@
               <w:rPr>
                 <w:sz w:val="14"/>
               </w:rPr>
-              <w:t>1 hora</w:t>
+              <w:t>A definir</w:t>
             </w:r>
           </w:p>
         </w:tc>
@@ -22686,7 +22686,7 @@
               <w:rPr>
                 <w:sz w:val="14"/>
               </w:rPr>
-              <w:t>1 hora</w:t>
+              <w:t>A definir</w:t>
             </w:r>
           </w:p>
         </w:tc>
@@ -23116,7 +23116,7 @@
               <w:rPr>
                 <w:sz w:val="14"/>
               </w:rPr>
-              <w:t>2 horas</w:t>
+              <w:t>A definir</w:t>
             </w:r>
           </w:p>
         </w:tc>
@@ -23545,7 +23545,7 @@
               <w:rPr>
                 <w:sz w:val="14"/>
               </w:rPr>
-              <w:t>2 horas (setup de reporte)</w:t>
+              <w:t>A definir</w:t>
             </w:r>
           </w:p>
         </w:tc>
@@ -23975,7 +23975,7 @@
               <w:rPr>
                 <w:sz w:val="14"/>
               </w:rPr>
-              <w:t>1 reunion</w:t>
+              <w:t>A definir</w:t>
             </w:r>
           </w:p>
         </w:tc>
@@ -24405,7 +24405,7 @@
               <w:rPr>
                 <w:sz w:val="14"/>
               </w:rPr>
-              <w:t>2-3 horas</w:t>
+              <w:t>A definir</w:t>
             </w:r>
           </w:p>
         </w:tc>
@@ -24837,7 +24837,7 @@
               <w:rPr>
                 <w:sz w:val="14"/>
               </w:rPr>
-              <w:t>1 reunion</w:t>
+              <w:t>A definir</w:t>
             </w:r>
           </w:p>
         </w:tc>
@@ -25266,7 +25266,7 @@
               <w:rPr>
                 <w:sz w:val="14"/>
               </w:rPr>
-              <w:t>1-2 horas</w:t>
+              <w:t>A definir</w:t>
             </w:r>
           </w:p>
         </w:tc>
@@ -25695,7 +25695,7 @@
               <w:rPr>
                 <w:sz w:val="14"/>
               </w:rPr>
-              <w:t>30 min de setup</w:t>
+              <w:t>A definir</w:t>
             </w:r>
           </w:p>
         </w:tc>
@@ -26126,7 +26126,7 @@
               <w:rPr>
                 <w:sz w:val="14"/>
               </w:rPr>
-              <w:t>1 dia (revision por lotes)</w:t>
+              <w:t>A definir</w:t>
             </w:r>
           </w:p>
         </w:tc>
@@ -26558,7 +26558,7 @@
               <w:rPr>
                 <w:sz w:val="14"/>
               </w:rPr>
-              <w:t>30 min</w:t>
+              <w:t>A definir</w:t>
             </w:r>
           </w:p>
         </w:tc>
@@ -26987,7 +26987,7 @@
               <w:rPr>
                 <w:sz w:val="14"/>
               </w:rPr>
-              <w:t>15-30 min en Ads Manager</w:t>
+              <w:t>A definir</w:t>
             </w:r>
           </w:p>
         </w:tc>
@@ -27418,7 +27418,7 @@
               <w:rPr>
                 <w:sz w:val="14"/>
               </w:rPr>
-              <w:t>15 min</w:t>
+              <w:t>A definir</w:t>
             </w:r>
           </w:p>
         </w:tc>
@@ -27850,7 +27850,7 @@
               <w:rPr>
                 <w:sz w:val="14"/>
               </w:rPr>
-              <w:t>1 reunion</w:t>
+              <w:t>A definir</w:t>
             </w:r>
           </w:p>
         </w:tc>
@@ -28279,7 +28279,7 @@
               <w:rPr>
                 <w:sz w:val="14"/>
               </w:rPr>
-              <w:t>30 min</w:t>
+              <w:t>A definir</w:t>
             </w:r>
           </w:p>
         </w:tc>
@@ -28711,7 +28711,7 @@
               <w:rPr>
                 <w:sz w:val="14"/>
               </w:rPr>
-              <w:t>1-2 horas</w:t>
+              <w:t>A definir</w:t>
             </w:r>
           </w:p>
         </w:tc>
@@ -29142,7 +29142,7 @@
               <w:rPr>
                 <w:sz w:val="14"/>
               </w:rPr>
-              <w:t>15 min</w:t>
+              <w:t>A definir</w:t>
             </w:r>
           </w:p>
         </w:tc>
@@ -29572,7 +29572,7 @@
               <w:rPr>
                 <w:sz w:val="14"/>
               </w:rPr>
-              <w:t>1 reunion + trabajo de implementacion si se decide consolidar</w:t>
+              <w:t>A definir</w:t>
             </w:r>
           </w:p>
         </w:tc>
@@ -30001,7 +30001,7 @@
               <w:rPr>
                 <w:sz w:val="14"/>
               </w:rPr>
-              <w:t>2-3 horas</w:t>
+              <w:t>A definir</w:t>
             </w:r>
           </w:p>
         </w:tc>
@@ -30430,7 +30430,7 @@
               <w:rPr>
                 <w:sz w:val="14"/>
               </w:rPr>
-              <w:t>1 dia (volumen alto, 53+18 imagenes)</w:t>
+              <w:t>A definir</w:t>
             </w:r>
           </w:p>
         </w:tc>
@@ -30861,7 +30861,7 @@
               <w:rPr>
                 <w:sz w:val="14"/>
               </w:rPr>
-              <w:t>2-3 horas</w:t>
+              <w:t>A definir</w:t>
             </w:r>
           </w:p>
         </w:tc>
@@ -31292,7 +31292,7 @@
               <w:rPr>
                 <w:sz w:val="14"/>
               </w:rPr>
-              <w:t>2-3 horas</w:t>
+              <w:t>A definir</w:t>
             </w:r>
           </w:p>
         </w:tc>
@@ -31724,7 +31724,7 @@
               <w:rPr>
                 <w:sz w:val="14"/>
               </w:rPr>
-              <w:t>2-3 horas (revisar los 7 y buscar si el patron se repite en el resto del blog)</w:t>
+              <w:t>A definir</w:t>
             </w:r>
           </w:p>
         </w:tc>
@@ -32154,7 +32154,7 @@
               <w:rPr>
                 <w:sz w:val="14"/>
               </w:rPr>
-              <w:t>15 min</w:t>
+              <w:t>A definir</w:t>
             </w:r>
           </w:p>
         </w:tc>
@@ -32583,7 +32583,7 @@
               <w:rPr>
                 <w:sz w:val="14"/>
               </w:rPr>
-              <w:t>10 min</w:t>
+              <w:t>A definir</w:t>
             </w:r>
           </w:p>
         </w:tc>
@@ -33012,7 +33012,7 @@
               <w:rPr>
                 <w:sz w:val="14"/>
               </w:rPr>
-              <w:t>30 min</w:t>
+              <w:t>A definir</w:t>
             </w:r>
           </w:p>
         </w:tc>
@@ -33441,7 +33441,7 @@
               <w:rPr>
                 <w:sz w:val="14"/>
               </w:rPr>
-              <w:t>30 min</w:t>
+              <w:t>A definir</w:t>
             </w:r>
           </w:p>
         </w:tc>
@@ -33870,7 +33870,7 @@
               <w:rPr>
                 <w:sz w:val="14"/>
               </w:rPr>
-              <w:t>20 min</w:t>
+              <w:t>A definir</w:t>
             </w:r>
           </w:p>
         </w:tc>
@@ -34299,7 +34299,7 @@
               <w:rPr>
                 <w:sz w:val="14"/>
               </w:rPr>
-              <w:t>30 min</w:t>
+              <w:t>A definir</w:t>
             </w:r>
           </w:p>
         </w:tc>
@@ -34729,7 +34729,7 @@
               <w:rPr>
                 <w:sz w:val="14"/>
               </w:rPr>
-              <w:t>1-2 horas</w:t>
+              <w:t>A definir</w:t>
             </w:r>
           </w:p>
         </w:tc>
@@ -35159,7 +35159,7 @@
               <w:rPr>
                 <w:sz w:val="14"/>
               </w:rPr>
-              <w:t>30 min</w:t>
+              <w:t>A definir</w:t>
             </w:r>
           </w:p>
         </w:tc>
@@ -35587,7 +35587,7 @@
               <w:rPr>
                 <w:sz w:val="14"/>
               </w:rPr>
-              <w:t>15 min</w:t>
+              <w:t>A definir</w:t>
             </w:r>
           </w:p>
         </w:tc>
@@ -36015,7 +36015,7 @@
               <w:rPr>
                 <w:sz w:val="14"/>
               </w:rPr>
-              <w:t>10 min</w:t>
+              <w:t>A definir</w:t>
             </w:r>
           </w:p>
         </w:tc>
@@ -36445,7 +36445,7 @@
               <w:rPr>
                 <w:sz w:val="14"/>
               </w:rPr>
-              <w:t>4-6 horas</w:t>
+              <w:t>A definir</w:t>
             </w:r>
           </w:p>
         </w:tc>
@@ -36875,7 +36875,7 @@
               <w:rPr>
                 <w:sz w:val="14"/>
               </w:rPr>
-              <w:t>4-6 horas</w:t>
+              <w:t>A definir</w:t>
             </w:r>
           </w:p>
         </w:tc>
@@ -37305,7 +37305,7 @@
               <w:rPr>
                 <w:sz w:val="14"/>
               </w:rPr>
-              <w:t>15 min</w:t>
+              <w:t>A definir</w:t>
             </w:r>
           </w:p>
         </w:tc>
@@ -37736,7 +37736,7 @@
               <w:rPr>
                 <w:sz w:val="14"/>
               </w:rPr>
-              <w:t>1-2 horas</w:t>
+              <w:t>A definir</w:t>
             </w:r>
           </w:p>
         </w:tc>
@@ -38166,7 +38166,7 @@
               <w:rPr>
                 <w:sz w:val="14"/>
               </w:rPr>
-              <w:t>30 min</w:t>
+              <w:t>A definir</w:t>
             </w:r>
           </w:p>
         </w:tc>
@@ -38595,7 +38595,7 @@
               <w:rPr>
                 <w:sz w:val="14"/>
               </w:rPr>
-              <w:t>1-2 horas</w:t>
+              <w:t>A definir</w:t>
             </w:r>
           </w:p>
         </w:tc>
@@ -39028,7 +39028,7 @@
               <w:rPr>
                 <w:sz w:val="14"/>
               </w:rPr>
-              <w:t>30 min</w:t>
+              <w:t>A definir</w:t>
             </w:r>
           </w:p>
         </w:tc>
@@ -39460,7 +39460,7 @@
               <w:rPr>
                 <w:sz w:val="14"/>
               </w:rPr>
-              <w:t>1 dia</w:t>
+              <w:t>A definir</w:t>
             </w:r>
           </w:p>
         </w:tc>
@@ -39892,7 +39892,7 @@
               <w:rPr>
                 <w:sz w:val="14"/>
               </w:rPr>
-              <w:t>2-4 horas</w:t>
+              <w:t>A definir</w:t>
             </w:r>
           </w:p>
         </w:tc>
@@ -40323,7 +40323,7 @@
               <w:rPr>
                 <w:sz w:val="14"/>
               </w:rPr>
-              <w:t>15 min</w:t>
+              <w:t>A definir</w:t>
             </w:r>
           </w:p>
         </w:tc>

</xml_diff>